<commit_message>
docs(resume): refresh copy and figures to vibey 4.2.0
Updates vibey figures (596 merged PRs, 25 releases, 86 ADRs, 149 plugins), adds the krypton apps, and rebuilds every variant, the freelance kit and the machine-readable outputs. All four PDFs stay at two pages.

Co-Authored-By: Claude Sonnet 5.5 <noreply@anthropic.com>

Made-With: Made with ❤️ by [Vibey](https://the-vibey-project.github.io/vibey/), Developed by [Adam Matthew Steinberger](https://vibewithadam.matthewsteinberger.com/) ([@adammatthewsteinberger](https://github.com/adammatthewsteinberger/)).
</commit_message>
<xml_diff>
--- a/adam-steinberger-resume-forward-deployed.docx
+++ b/adam-steinberger-resume-forward-deployed.docx
@@ -94,7 +94,7 @@
         <w:rPr>
           <w:b/>
         </w:rPr>
-        <w:t>Available now for forward-deployed and customer-facing AI engineering roles. Based in Greenville, SC; working US-remote.</w:t>
+        <w:t>Available now for forward-deployed and customer-facing AI engineering roles. US-remote.</w:t>
       </w:r>
     </w:p>
     <w:p>
@@ -115,7 +115,7 @@
     </w:p>
     <w:p>
       <w:r>
-        <w:t>For 13 years I've turned unclear business problems into production systems for insurance, lending, healthcare and industrial-testing teams, as an employee, a founding engineer and an independent consultant. My method is steady: discovery, a written solution, decomposition into work, then a handoff to someone I've mentored. Most recently I led AI platforms that put language models into real operational work, such as payroll, engineering reports and identity governance, with a person approving every step that can't be undone.</w:t>
+        <w:t>For 14 years I've turned unclear business problems into production systems for insurance, lending, healthcare and industrial-testing teams, as an employee, a founding engineer and an independent consultant. My method is steady: discovery, a written solution, decomposition into work, then a handoff to someone I've mentored. Most recently I led AI platforms that put language models into real operational work, such as payroll, engineering reports and identity governance, with a person approving every step that can't be undone.</w:t>
       </w:r>
     </w:p>
     <w:p>
@@ -257,7 +257,7 @@
         <w:t>(MIT; on PyPI as vibey-engine)</w:t>
       </w:r>
       <w:r>
-        <w:t>. A conductor that carries a change from a spec interview through design, build and review, handing work between Claude Code, OpenAI Codex, Cursor Agent, Google Antigravity and local open-weight models, and asking a person only for the decisions that are theirs to make. Built with AI coding agents working inside its own CI gates.</w:t>
+        <w:t>. A conductor that carries a change from a spec interview through design, build and review, handing work between Claude Code, OpenAI Codex, Cursor Agent, Google Antigravity and local open-weight models, and asking a person only for the decisions that are theirs to make. AI coding agents build it, and they answer to its own CI gates.</w:t>
       </w:r>
     </w:p>
     <w:p>
@@ -296,7 +296,7 @@
         <w:t>Held to its own gates.</w:t>
       </w:r>
       <w:r>
-        <w:t xml:space="preserve"> 100% branch-coverage floors in CI, 75 architecture decision records, a Helm chart (KEDA, kopf operator) installed on minikube in CI, and 19 releases from 450+ merged pull requests since August 2026. The design is written up as a paper and the documentation as a book.</w:t>
+        <w:t xml:space="preserve"> 100% branch-coverage floors in CI, 86 architecture decision records, and a Helm chart (KEDA, kopf operator) installed on minikube in CI. In its first two months: 596 merged pull requests and 25 releases. The design is a paper; the documentation is a book.</w:t>
       </w:r>
     </w:p>
     <w:p>
@@ -590,7 +590,7 @@
           <w:color w:val="59626D"/>
         </w:rPr>
         <w:tab/>
-        <w:t>Mar 2025 – 2026</w:t>
+        <w:t>Mar 2025 – Aug 2025</w:t>
       </w:r>
     </w:p>
     <w:p>
@@ -1025,7 +1025,7 @@
         </w:r>
       </w:hyperlink>
       <w:r>
-        <w:t>. Conductor for AI coding agents, five engine runners, the vibey-gh release tool and vibey-bootstrap. MIT; pip install vibey-engine. Contributors welcome.</w:t>
+        <w:t>. Conductor for AI coding agents, five engine runners, the vibey-gh release tool, vibey-bootstrap and krypton apps for desktop, mobile, web and VS Code. MIT; pip install vibey-engine. Contributors welcome.</w:t>
       </w:r>
     </w:p>
     <w:p>
@@ -1041,7 +1041,7 @@
         </w:r>
       </w:hyperlink>
       <w:r>
-        <w:t>. A 140-plugin Claude Code skills marketplace, shipped inside vibey.</w:t>
+        <w:t>. A 149-plugin Claude Code skills marketplace, shipped inside vibey.</w:t>
       </w:r>
     </w:p>
     <w:p>

</xml_diff>